<commit_message>
Add SCI submission checklist and final file audit
</commit_message>
<xml_diff>
--- a/outputs_large/CXR_Final_Submission_Package_15.docx
+++ b/outputs_large/CXR_Final_Submission_Package_15.docx
@@ -3419,7 +3419,7 @@
                 <w:rFonts w:ascii="Calibri" w:hAnsi="Calibri"/>
                 <w:sz w:val="16"/>
               </w:rPr>
-              <w:t>26 current references, final formatting to be verified</w:t>
+              <w:t>27 current references, final formatting to be verified</w:t>
             </w:r>
           </w:p>
         </w:tc>
@@ -6075,7 +6075,7 @@
                 <w:rFonts w:ascii="Calibri" w:hAnsi="Calibri"/>
                 <w:sz w:val="16"/>
               </w:rPr>
-              <w:t>[TO BE FILLED: repository or archive link]</w:t>
+              <w:t>GitHub repository: https://github.com/a1553189184-stack/SCI; Zenodo DOI: https://doi.org/10.5281/zenodo.20688290; fixed release: https://github.com/a1553189184-stack/SCI/releases/tag/v1.0-reviewer-package</w:t>
             </w:r>
           </w:p>
         </w:tc>
@@ -10447,7 +10447,7 @@
         <w:pStyle w:val="ListBullet"/>
       </w:pPr>
       <w:r>
-        <w:t>Repository or archive link.</w:t>
+        <w:t>Journal-specific data/code availability form wording, if requested.</w:t>
       </w:r>
     </w:p>
     <w:p>

</xml_diff>